<commit_message>
Update PFEM Test Plan
</commit_message>
<xml_diff>
--- a/Test-Plan-Personal-Finance-Expense-Manager.docx
+++ b/Test-Plan-Personal-Finance-Expense-Manager.docx
@@ -32,22 +32,194 @@
       </w:pPr>
       <w:r>
         <w:rPr>
-          <w:sz w:val="22"/>
+          <w:b/>
         </w:rPr>
-        <w:t>Team 9 — PES1UG24CS571 — Girish G N</w:t>
+        <w:t>Team 9 — Personal Finance &amp; Expense Manager</w:t>
       </w:r>
     </w:p>
-    <w:p>
-      <w:pPr>
-        <w:jc w:val="center"/>
-      </w:pPr>
-      <w:r>
-        <w:rPr>
-          <w:i/>
-        </w:rPr>
-        <w:t>Corrected version based strictly on the PFEM SRS and Test Plan handout</w:t>
-      </w:r>
-    </w:p>
+    <w:tbl>
+      <w:tblPr>
+        <w:tblStyle w:val="TableGrid"/>
+        <w:tblW w:type="auto" w:w="0"/>
+        <w:tblLook w:firstColumn="1" w:firstRow="1" w:lastColumn="0" w:lastRow="0" w:noHBand="0" w:noVBand="1" w:val="04A0"/>
+      </w:tblPr>
+      <w:tblGrid>
+        <w:gridCol w:w="7272"/>
+        <w:gridCol w:w="7272"/>
+      </w:tblGrid>
+      <w:tr>
+        <w:tc>
+          <w:tcPr>
+            <w:tcW w:type="dxa" w:w="7272"/>
+          </w:tcPr>
+          <w:p>
+            <w:pPr>
+              <w:spacing w:after="0" w:before="0"/>
+            </w:pPr>
+            <w:r>
+              <w:rPr>
+                <w:b/>
+                <w:sz w:val="18"/>
+              </w:rPr>
+              <w:t>Team Member</w:t>
+            </w:r>
+          </w:p>
+        </w:tc>
+        <w:tc>
+          <w:tcPr>
+            <w:tcW w:type="dxa" w:w="7272"/>
+          </w:tcPr>
+          <w:p>
+            <w:pPr>
+              <w:spacing w:after="0" w:before="0"/>
+            </w:pPr>
+            <w:r>
+              <w:rPr>
+                <w:b/>
+                <w:sz w:val="18"/>
+              </w:rPr>
+              <w:t>SRN</w:t>
+            </w:r>
+          </w:p>
+        </w:tc>
+      </w:tr>
+      <w:tr>
+        <w:tc>
+          <w:tcPr>
+            <w:tcW w:type="dxa" w:w="7272"/>
+          </w:tcPr>
+          <w:p>
+            <w:pPr>
+              <w:spacing w:after="0" w:before="0"/>
+            </w:pPr>
+            <w:r>
+              <w:rPr>
+                <w:sz w:val="18"/>
+              </w:rPr>
+              <w:t>Abdul Muheeth K</w:t>
+            </w:r>
+          </w:p>
+        </w:tc>
+        <w:tc>
+          <w:tcPr>
+            <w:tcW w:type="dxa" w:w="7272"/>
+          </w:tcPr>
+          <w:p>
+            <w:pPr>
+              <w:spacing w:after="0" w:before="0"/>
+            </w:pPr>
+            <w:r>
+              <w:rPr>
+                <w:sz w:val="18"/>
+              </w:rPr>
+              <w:t>PES1UG24CS550</w:t>
+            </w:r>
+          </w:p>
+        </w:tc>
+      </w:tr>
+      <w:tr>
+        <w:tc>
+          <w:tcPr>
+            <w:tcW w:type="dxa" w:w="7272"/>
+          </w:tcPr>
+          <w:p>
+            <w:pPr>
+              <w:spacing w:after="0" w:before="0"/>
+            </w:pPr>
+            <w:r>
+              <w:rPr>
+                <w:sz w:val="18"/>
+              </w:rPr>
+              <w:t>Girish G N</w:t>
+            </w:r>
+          </w:p>
+        </w:tc>
+        <w:tc>
+          <w:tcPr>
+            <w:tcW w:type="dxa" w:w="7272"/>
+          </w:tcPr>
+          <w:p>
+            <w:pPr>
+              <w:spacing w:after="0" w:before="0"/>
+            </w:pPr>
+            <w:r>
+              <w:rPr>
+                <w:sz w:val="18"/>
+              </w:rPr>
+              <w:t>PES1UG24CS571</w:t>
+            </w:r>
+          </w:p>
+        </w:tc>
+      </w:tr>
+      <w:tr>
+        <w:tc>
+          <w:tcPr>
+            <w:tcW w:type="dxa" w:w="7272"/>
+          </w:tcPr>
+          <w:p>
+            <w:pPr>
+              <w:spacing w:after="0" w:before="0"/>
+            </w:pPr>
+            <w:r>
+              <w:rPr>
+                <w:sz w:val="18"/>
+              </w:rPr>
+              <w:t>Nikhil P</w:t>
+            </w:r>
+          </w:p>
+        </w:tc>
+        <w:tc>
+          <w:tcPr>
+            <w:tcW w:type="dxa" w:w="7272"/>
+          </w:tcPr>
+          <w:p>
+            <w:pPr>
+              <w:spacing w:after="0" w:before="0"/>
+            </w:pPr>
+            <w:r>
+              <w:rPr>
+                <w:sz w:val="18"/>
+              </w:rPr>
+              <w:t>PES1UG24CS583</w:t>
+            </w:r>
+          </w:p>
+        </w:tc>
+      </w:tr>
+      <w:tr>
+        <w:tc>
+          <w:tcPr>
+            <w:tcW w:type="dxa" w:w="7272"/>
+          </w:tcPr>
+          <w:p>
+            <w:pPr>
+              <w:spacing w:after="0" w:before="0"/>
+            </w:pPr>
+            <w:r>
+              <w:rPr>
+                <w:sz w:val="18"/>
+              </w:rPr>
+              <w:t>Prajwal G</w:t>
+            </w:r>
+          </w:p>
+        </w:tc>
+        <w:tc>
+          <w:tcPr>
+            <w:tcW w:type="dxa" w:w="7272"/>
+          </w:tcPr>
+          <w:p>
+            <w:pPr>
+              <w:spacing w:after="0" w:before="0"/>
+            </w:pPr>
+            <w:r>
+              <w:rPr>
+                <w:sz w:val="18"/>
+              </w:rPr>
+              <w:t>PES1UG24CS590</w:t>
+            </w:r>
+          </w:p>
+        </w:tc>
+      </w:tr>
+    </w:tbl>
     <w:p>
       <w:pPr>
         <w:pStyle w:val="Heading1"/>
@@ -76,7 +248,7 @@
     </w:p>
     <w:p>
       <w:r>
-        <w:t>UT_xx = Unit Test, IT_xx = Integration Test, ST_xx = System Test. Every test case ID in this corrected document is unique. The corrected plan uses the SRS Appendix C identifiers where they can be retained without collision, and assigns new unique identifiers to added coverage. The traceability appendix below reflects the corrected plan.</w:t>
+        <w:t>UT_xx = Unit Test, IT_xx = Integration Test, ST_xx = System Test. Every test case ID in this document is unique. This plan uses the SRS Appendix C identifiers where they can be retained without collision, and assigns new unique identifiers to added coverage. The traceability appendix below reflects this plan.</w:t>
       </w:r>
     </w:p>
     <w:p>
@@ -20630,7 +20802,7 @@
     </w:p>
     <w:p>
       <w:r>
-        <w:t>This appendix is generated from the corrected Test Plan. It provides a quick check that each SRS requirement is represented by one or more test cases. It also includes SEC-8 and selected Section 6 performance/safety requirements.</w:t>
+        <w:t>This appendix is generated from this Test Plan. It provides a quick check that each SRS requirement is represented by one or more test cases. It also includes SEC-8 and selected Section 6 performance/safety requirements.</w:t>
       </w:r>
     </w:p>
     <w:tbl>

</xml_diff>